<commit_message>
Strip the metadata block from DOCX exports and set core properties from it
</commit_message>
<xml_diff>
--- a/plugins/exporter-docx/test/fixtures/test-exporter.docx
+++ b/plugins/exporter-docx/test/fixtures/test-exporter.docx
@@ -131,7 +131,7 @@
       <w:r>
         <w:t xml:space="preserve">A </w:t>
       </w:r>
-      <w:hyperlink w:history="1" r:id="rIdiqa1hedrqzljdlj2aftqi">
+      <w:hyperlink w:history="1" r:id="rIdp4y8usa5lfcesnt7kyynz">
         <w:r>
           <w:rPr>
             <w:rStyle w:val="Hyperlink"/>
@@ -222,7 +222,7 @@
       <w:pPr>
         <w:pStyle w:val="Body"/>
       </w:pPr>
-      <w:hyperlink w:history="1" r:id="rIdd_mti-clswa0k99fae4ru">
+      <w:hyperlink w:history="1" r:id="rIdx8gw2s0adttl1kplghlte">
         <w:r>
           <w:rPr>
             <w:rStyle w:val="Hyperlink"/>

</xml_diff>